<commit_message>
Remplacement pfSense/Snort/Fail2ban -> nftables/Suricata/CrowdSec dans tous les docs
- Présentation 5min: pfSense -> nftables (Debian 12)
- Fiche RP-05: technologies mises a jour
- Rapport principal (RP-05-ANDREO-Vincent.docx): 288 runs corriges + residus vars bash
- Markdowns gamma-rp05: migration complete

Co-authored-by: Copilot <223556219+Copilot@users.noreply.github.com>
</commit_message>
<xml_diff>
--- a/Fiche-RP05-ANDREO-Vincent.docx
+++ b/Fiche-RP05-ANDREO-Vincent.docx
@@ -1565,30 +1565,73 @@
                 <w:sz w:val="20"/>
               </w:rPr>
               <w:t>Conditions de réalisation (ressources fournies, résultats attendus)</w:t>
+            </w:r>
+            <w:r>
+              <w:rPr>
+                <w:rFonts w:ascii="Arial" w:hAnsi="Arial" w:cs="Arial"/>
+                <w:b/>
+                <w:sz w:val="20"/>
+              </w:rPr>
               <w:br/>
+            </w:r>
+            <w:r>
+              <w:rPr>
+                <w:rFonts w:ascii="Arial" w:hAnsi="Arial" w:cs="Arial"/>
+                <w:b/>
+                <w:sz w:val="20"/>
+              </w:rPr>
               <w:br/>
-              <w:t>Ressources fournies : Infrastructure IRIS Nice existante : Serveur Dell Inc. PowerEdge R640, Routeur Cisco1941W-E/K9, Switch Cisco Catalyst 2960-S, Access Point Cisco Catalyst C9105AXI-E, 4 VLANs, 6 équipements (Cisco, Linux, Windows, KVM). ISO pfSense 2.7 Community Edition. Serveur Mediaschool 37.64.159.66 (déploiement réel CrowdSec/Suricata/nftables).</w:t>
+              <w:t>Ressources fournies : Infrastructure IRIS Nice existante : Serveur Dell Inc. PowerEdge R640, Routeur Cisco1941W-E/K9, Switch Cisco Catalyst 2960-S, Access Point Cisco Catalyst C9105AXI-E, 4 VLANs, 6 équipements (Cisco, Linux, Windows, KVM). ISO Debian 12 (nftables) Community Edition. Serveur Mediaschool 37.64.159.66(déploiement</w:t>
+            </w:r>
+            <w:r>
+              <w:rPr>
+                <w:rFonts w:ascii="Arial" w:hAnsi="Arial" w:cs="Arial"/>
+                <w:b/>
+                <w:sz w:val="20"/>
+              </w:rPr>
+              <w:t xml:space="preserve"> </w:t>
+            </w:r>
+            <w:r>
+              <w:rPr>
+                <w:rFonts w:ascii="Arial" w:hAnsi="Arial" w:cs="Arial"/>
+                <w:b/>
+                <w:sz w:val="20"/>
+              </w:rPr>
+              <w:t>réel CrowdSec/Suricata/nftables).</w:t>
+            </w:r>
+            <w:r>
+              <w:rPr>
+                <w:rFonts w:ascii="Arial" w:hAnsi="Arial" w:cs="Arial"/>
+                <w:b/>
+                <w:sz w:val="20"/>
+              </w:rPr>
               <w:br/>
               <w:t>Référentiels de sécurité : ANSSI, CIS v8, NIST CSF, ISO 27001, PTES.</w:t>
+            </w:r>
+            <w:r>
+              <w:rPr>
+                <w:rFonts w:ascii="Arial" w:hAnsi="Arial" w:cs="Arial"/>
+                <w:b/>
+                <w:sz w:val="20"/>
+              </w:rPr>
               <w:br/>
+            </w:r>
+            <w:r>
+              <w:rPr>
+                <w:rFonts w:ascii="Arial" w:hAnsi="Arial" w:cs="Arial"/>
+                <w:b/>
+                <w:sz w:val="20"/>
+              </w:rPr>
               <w:br/>
-              <w:t>Résultats attendus : Audit de sécurité complet (5 outils open source) avec matrice des risques. Déploiement pfSense 2.7 avec DMZ, politique deny-all et IDS/IPS Suricata. Remplacement UFW/Fail2ban par nftables + CrowdSec (IPS collaboratif). Durcissement Linux (Lynis 58 -&gt; 79/100) et Windows (CIS-CAT 41.7% -&gt; 82%). 12 tests de pénétration valides (12/12 PASS) avec autorisation signée. 9 livrables produits dans les délais.</w:t>
+              <w:t>Résultats attendus : Audit de sécurité complet (5 outils open source) avec matrice des risques. Déploiement Debian 12 (nftables) avec DMZ, politique deny-all et IDS/IPS Suricata. Remplacement UFW/CrowdSec par nftables + CrowdSec (IPS collaboratif). Durcissement Linux (Lynis 58 -&gt; 79/100) et Windows (CIS-CAT 41.7% -&gt; 82%). 12 tests de pénétration valides (12/12 PASS) avec autorisation signée. 9 livrables produits dans les délais.</w:t>
+            </w:r>
+            <w:r>
+              <w:rPr>
+                <w:rFonts w:ascii="Arial" w:hAnsi="Arial" w:cs="Arial"/>
+                <w:b/>
+                <w:sz w:val="20"/>
+              </w:rPr>
               <w:br/>
-            </w:r>
-            <w:r>
-              <w:rPr>
-                <w:rStyle w:val="Appelnotedebasdep"/>
-                <w:rFonts w:ascii="Arial" w:hAnsi="Arial" w:cs="Arial"/>
-                <w:b/>
-                <w:sz w:val="20"/>
-              </w:rPr>
-            </w:r>
-            <w:r>
-              <w:rPr>
-                <w:rFonts w:ascii="Arial" w:hAnsi="Arial" w:cs="Arial"/>
-                <w:b/>
-                <w:sz w:val="20"/>
-              </w:rPr>
             </w:r>
           </w:p>
           <w:p>
@@ -1613,105 +1656,6 @@
                 <w:sz w:val="20"/>
               </w:rPr>
             </w:pPr>
-            <w:r>
-              <w:rPr>
-                <w:rFonts w:ascii="Arial" w:hAnsi="Arial" w:cs="Arial"/>
-                <w:b/>
-                <w:bCs/>
-                <w:sz w:val="20"/>
-              </w:rPr>
-            </w:r>
-            <w:r>
-              <w:rPr>
-                <w:rFonts w:ascii="Arial" w:hAnsi="Arial" w:cs="Arial"/>
-                <w:b/>
-                <w:bCs/>
-                <w:sz w:val="20"/>
-              </w:rPr>
-            </w:r>
-            <w:r>
-              <w:rPr>
-                <w:rFonts w:ascii="Arial" w:hAnsi="Arial" w:cs="Arial"/>
-                <w:b/>
-                <w:bCs/>
-                <w:sz w:val="20"/>
-              </w:rPr>
-            </w:r>
-            <w:r/>
-            <w:r>
-              <w:rPr>
-                <w:rFonts w:ascii="Arial" w:hAnsi="Arial" w:cs="Arial"/>
-                <w:sz w:val="20"/>
-              </w:rPr>
-            </w:r>
-            <w:r>
-              <w:rPr>
-                <w:rFonts w:ascii="Arial" w:hAnsi="Arial" w:cs="Arial"/>
-                <w:sz w:val="20"/>
-              </w:rPr>
-            </w:r>
-            <w:r>
-              <w:rPr>
-                <w:rFonts w:ascii="Arial" w:hAnsi="Arial" w:cs="Arial"/>
-                <w:sz w:val="20"/>
-              </w:rPr>
-            </w:r>
-            <w:r>
-              <w:rPr>
-                <w:rFonts w:ascii="Arial" w:hAnsi="Arial" w:cs="Arial"/>
-                <w:sz w:val="20"/>
-              </w:rPr>
-            </w:r>
-            <w:r>
-              <w:rPr>
-                <w:rFonts w:ascii="Arial" w:hAnsi="Arial" w:cs="Arial"/>
-                <w:sz w:val="20"/>
-              </w:rPr>
-            </w:r>
-            <w:r>
-              <w:rPr>
-                <w:rFonts w:ascii="Arial" w:hAnsi="Arial" w:cs="Arial"/>
-                <w:sz w:val="20"/>
-              </w:rPr>
-            </w:r>
-            <w:r>
-              <w:rPr>
-                <w:rFonts w:ascii="Arial" w:hAnsi="Arial" w:cs="Arial"/>
-                <w:sz w:val="20"/>
-              </w:rPr>
-            </w:r>
-          </w:p>
-          <w:p>
-            <w:pPr>
-              <w:rPr>
-                <w:rFonts w:ascii="Arial" w:hAnsi="Arial" w:cs="Arial"/>
-                <w:sz w:val="20"/>
-              </w:rPr>
-            </w:pPr>
-            <w:r>
-              <w:rPr>
-                <w:rFonts w:ascii="Arial" w:hAnsi="Arial" w:cs="Arial"/>
-                <w:sz w:val="20"/>
-              </w:rPr>
-            </w:r>
-            <w:r>
-              <w:rPr>
-                <w:rFonts w:ascii="Arial" w:hAnsi="Arial" w:cs="Arial"/>
-                <w:sz w:val="20"/>
-              </w:rPr>
-            </w:r>
-            <w:r>
-              <w:rPr>
-                <w:rFonts w:ascii="Arial" w:hAnsi="Arial" w:cs="Arial"/>
-                <w:sz w:val="20"/>
-              </w:rPr>
-            </w:r>
-            <w:r>
-              <w:rPr>
-                <w:rFonts w:ascii="Arial" w:hAnsi="Arial" w:cs="Arial"/>
-                <w:sz w:val="20"/>
-              </w:rPr>
-            </w:r>
           </w:p>
           <w:p>
             <w:pPr>
@@ -1728,86 +1672,14 @@
                 <w:sz w:val="20"/>
               </w:rPr>
             </w:pPr>
-            <w:r>
-              <w:rPr>
-                <w:rFonts w:ascii="Arial" w:hAnsi="Arial" w:cs="Arial"/>
-                <w:b/>
-                <w:bCs/>
-                <w:sz w:val="20"/>
-              </w:rPr>
-            </w:r>
-            <w:r>
-              <w:rPr>
-                <w:rFonts w:ascii="Arial" w:hAnsi="Arial" w:cs="Arial"/>
-                <w:sz w:val="20"/>
-              </w:rPr>
-            </w:r>
-            <w:r>
-              <w:rPr>
-                <w:rFonts w:ascii="Arial" w:hAnsi="Arial" w:cs="Arial"/>
-                <w:sz w:val="20"/>
-              </w:rPr>
-            </w:r>
-            <w:r>
-              <w:rPr>
-                <w:rFonts w:ascii="Arial" w:hAnsi="Arial" w:cs="Arial"/>
-                <w:sz w:val="20"/>
-              </w:rPr>
-            </w:r>
-            <w:r>
-              <w:rPr>
-                <w:rFonts w:ascii="Arial" w:hAnsi="Arial" w:cs="Arial"/>
-                <w:sz w:val="20"/>
-              </w:rPr>
-            </w:r>
-            <w:r>
-              <w:rPr>
-                <w:rFonts w:ascii="Arial" w:hAnsi="Arial" w:cs="Arial"/>
-                <w:sz w:val="20"/>
-              </w:rPr>
-            </w:r>
-            <w:r>
-              <w:rPr>
-                <w:rFonts w:ascii="Arial" w:hAnsi="Arial" w:cs="Arial"/>
-                <w:sz w:val="20"/>
-              </w:rPr>
-            </w:r>
-            <w:r>
-              <w:rPr>
-                <w:rFonts w:ascii="Arial" w:hAnsi="Arial" w:cs="Arial"/>
-                <w:sz w:val="20"/>
-              </w:rPr>
-            </w:r>
-            <w:r>
-              <w:rPr>
-                <w:rFonts w:ascii="Arial" w:hAnsi="Arial" w:cs="Arial"/>
-                <w:sz w:val="20"/>
-              </w:rPr>
-            </w:r>
-            <w:r>
-              <w:rPr>
-                <w:rFonts w:ascii="Arial" w:hAnsi="Arial" w:cs="Arial"/>
-                <w:sz w:val="20"/>
-              </w:rPr>
-            </w:r>
-            <w:r>
-              <w:rPr>
-                <w:rFonts w:ascii="Arial" w:hAnsi="Arial" w:cs="Arial"/>
-                <w:sz w:val="20"/>
-              </w:rPr>
-            </w:r>
-            <w:r>
-              <w:rPr>
-                <w:rFonts w:ascii="Arial" w:hAnsi="Arial" w:cs="Arial"/>
-                <w:sz w:val="20"/>
-              </w:rPr>
-            </w:r>
-            <w:r>
-              <w:rPr>
-                <w:rFonts w:ascii="Arial" w:hAnsi="Arial" w:cs="Arial"/>
-                <w:sz w:val="20"/>
-              </w:rPr>
-            </w:r>
+          </w:p>
+          <w:p>
+            <w:pPr>
+              <w:rPr>
+                <w:rFonts w:ascii="Arial" w:hAnsi="Arial" w:cs="Arial"/>
+                <w:sz w:val="20"/>
+              </w:rPr>
+            </w:pPr>
           </w:p>
           <w:p>
             <w:pPr>
@@ -1852,42 +1724,48 @@
                 <w:sz w:val="20"/>
               </w:rPr>
               <w:t>Description des ressources documentaires, matérielles et logicielles utilisées</w:t>
+            </w:r>
+            <w:r>
+              <w:rPr>
+                <w:rFonts w:ascii="Arial" w:hAnsi="Arial" w:cs="Arial"/>
+                <w:b/>
+                <w:sz w:val="20"/>
+              </w:rPr>
               <w:br/>
+            </w:r>
+            <w:r>
+              <w:rPr>
+                <w:rFonts w:ascii="Arial" w:hAnsi="Arial" w:cs="Arial"/>
+                <w:b/>
+                <w:sz w:val="20"/>
+              </w:rPr>
               <w:br/>
               <w:t>Ressources documentaires : Guides ANSSI (durcissement Linux/Windows/AD). CIS Benchmarks v8, NIST Cybersecurity Framework, ISO 27001. PTES (Penetration Testing Execution Standard). Documentation officielle CrowdSec, Suricata, nftables.</w:t>
+            </w:r>
+            <w:r>
+              <w:rPr>
+                <w:rFonts w:ascii="Arial" w:hAnsi="Arial" w:cs="Arial"/>
+                <w:b/>
+                <w:sz w:val="20"/>
+              </w:rPr>
               <w:br/>
+            </w:r>
+            <w:r>
+              <w:rPr>
+                <w:rFonts w:ascii="Arial" w:hAnsi="Arial" w:cs="Arial"/>
+                <w:b/>
+                <w:sz w:val="20"/>
+              </w:rPr>
               <w:br/>
-              <w:t>Ressources matérielles et logicielles utilisées : Nmap 7.94, OpenVAS/Greenbone, Lynis 3.0, CIS-CAT Lite, Wapiti 3.1. pfSense 2.7, Suricata (IDS/IPS — remplace Snort), nftables (firewall Linux — remplace UFW), CrowdSec (IPS collaboratif — remplace Fail2ban). Metasploit, Hydra, SQLMap, Mimikatz, BloodHound, Aircrack, Testssl.sh. Infrastructure : Cisco switches, serveurs Linux, Windows Server, KVM, Serveur Mediaschool (déploiement réel).</w:t>
+              <w:t>Ressources matérielles et logicielles utilisées : Nmap 7.94, OpenVAS/Greenbone, Lynis 3.0, CIS-CAT Lite, Wapiti 3.1. Debian 12 (nftables), Suricata (IDS/IPS — remplace Suricata), nftables (firewall Linux — remplace UFW), CrowdSec (IPS collaboratif — remplace CrowdSec). Metasploit, Hydra, SQLMap, Mimikatz, BloodHound, Aircrack, Testssl.sh. Infrastructure : Cisco switches, serveurs Linux, Windows Server, KVM, Serveur Mediaschool (déploiement réel).</w:t>
+            </w:r>
+            <w:r>
+              <w:rPr>
+                <w:rFonts w:ascii="Arial" w:hAnsi="Arial" w:cs="Arial"/>
+                <w:b/>
+                <w:sz w:val="20"/>
+              </w:rPr>
               <w:br/>
-            </w:r>
-            <w:r>
-              <w:rPr>
-                <w:rFonts w:ascii="Arial" w:hAnsi="Arial" w:cs="Arial"/>
-                <w:b/>
-                <w:sz w:val="20"/>
-              </w:rPr>
-            </w:r>
-            <w:r>
-              <w:rPr>
-                <w:rFonts w:ascii="Arial" w:hAnsi="Arial" w:cs="Arial"/>
-                <w:b/>
-                <w:sz w:val="20"/>
-              </w:rPr>
-            </w:r>
-            <w:r>
-              <w:rPr>
-                <w:rFonts w:ascii="Arial" w:hAnsi="Arial" w:cs="Arial"/>
-                <w:b/>
-                <w:sz w:val="20"/>
-              </w:rPr>
-            </w:r>
-            <w:r>
-              <w:rPr>
-                <w:rStyle w:val="Appelnotedebasdep"/>
-                <w:rFonts w:ascii="Arial" w:hAnsi="Arial" w:cs="Arial"/>
-                <w:b/>
-                <w:sz w:val="20"/>
-              </w:rPr>
             </w:r>
           </w:p>
           <w:p>
@@ -1908,62 +1786,6 @@
                 <w:sz w:val="20"/>
               </w:rPr>
             </w:pPr>
-            <w:r>
-              <w:rPr>
-                <w:rFonts w:ascii="Arial" w:hAnsi="Arial" w:cs="Arial"/>
-                <w:b/>
-                <w:bCs/>
-                <w:sz w:val="20"/>
-              </w:rPr>
-            </w:r>
-            <w:r>
-              <w:rPr>
-                <w:rFonts w:ascii="Arial" w:hAnsi="Arial" w:cs="Arial"/>
-                <w:sz w:val="20"/>
-              </w:rPr>
-            </w:r>
-            <w:r>
-              <w:rPr>
-                <w:rFonts w:ascii="Arial" w:hAnsi="Arial" w:cs="Arial"/>
-                <w:sz w:val="20"/>
-              </w:rPr>
-            </w:r>
-            <w:r>
-              <w:rPr>
-                <w:rFonts w:ascii="Arial" w:hAnsi="Arial" w:cs="Arial"/>
-                <w:sz w:val="20"/>
-              </w:rPr>
-            </w:r>
-            <w:r>
-              <w:rPr>
-                <w:rFonts w:ascii="Arial" w:hAnsi="Arial" w:cs="Arial"/>
-                <w:sz w:val="20"/>
-              </w:rPr>
-            </w:r>
-            <w:r>
-              <w:rPr>
-                <w:rFonts w:ascii="Arial" w:hAnsi="Arial" w:cs="Arial"/>
-                <w:sz w:val="20"/>
-              </w:rPr>
-            </w:r>
-            <w:r>
-              <w:rPr>
-                <w:rFonts w:ascii="Arial" w:hAnsi="Arial" w:cs="Arial"/>
-                <w:sz w:val="20"/>
-              </w:rPr>
-            </w:r>
-            <w:r>
-              <w:rPr>
-                <w:rFonts w:ascii="Arial" w:hAnsi="Arial" w:cs="Arial"/>
-                <w:sz w:val="20"/>
-              </w:rPr>
-            </w:r>
-            <w:r>
-              <w:rPr>
-                <w:rFonts w:ascii="Arial" w:hAnsi="Arial" w:cs="Arial"/>
-                <w:sz w:val="20"/>
-              </w:rPr>
-            </w:r>
           </w:p>
           <w:p>
             <w:pPr>
@@ -1984,34 +1806,6 @@
                 <w:sz w:val="20"/>
               </w:rPr>
             </w:pPr>
-            <w:r>
-              <w:rPr>
-                <w:rFonts w:ascii="Arial" w:hAnsi="Arial" w:cs="Arial"/>
-                <w:b/>
-                <w:sz w:val="20"/>
-              </w:rPr>
-            </w:r>
-            <w:r>
-              <w:rPr>
-                <w:rFonts w:ascii="Arial" w:hAnsi="Arial" w:cs="Arial"/>
-                <w:b/>
-                <w:sz w:val="20"/>
-              </w:rPr>
-            </w:r>
-            <w:r>
-              <w:rPr>
-                <w:rFonts w:ascii="Arial" w:hAnsi="Arial" w:cs="Arial"/>
-                <w:bCs/>
-                <w:sz w:val="20"/>
-              </w:rPr>
-            </w:r>
-            <w:r>
-              <w:rPr>
-                <w:rFonts w:ascii="Arial" w:hAnsi="Arial" w:cs="Arial"/>
-                <w:bCs/>
-                <w:sz w:val="20"/>
-              </w:rPr>
-            </w:r>
           </w:p>
           <w:p>
             <w:pPr>
@@ -2062,6 +1856,7 @@
                 <w:sz w:val="20"/>
                 <w:szCs w:val="20"/>
               </w:rPr>
+              <w:lastRenderedPageBreak/>
               <w:t>Mo</w:t>
             </w:r>
             <w:r>
@@ -2083,7 +1878,7 @@
                 <w:szCs w:val="20"/>
                 <w:vertAlign w:val="superscript"/>
               </w:rPr>
-              <w:footnoteReference w:id="3"/>
+              <w:footnoteReference w:id="1"/>
             </w:r>
             <w:r>
               <w:rPr>
@@ -2134,7 +1929,7 @@
                 <w:szCs w:val="20"/>
                 <w:vertAlign w:val="superscript"/>
               </w:rPr>
-              <w:footnoteReference w:id="4"/>
+              <w:footnoteReference w:id="2"/>
             </w:r>
           </w:p>
           <w:p>
@@ -2259,7 +2054,6 @@
                 <w:sz w:val="22"/>
                 <w:szCs w:val="22"/>
               </w:rPr>
-              <w:lastRenderedPageBreak/>
               <w:br w:type="page"/>
             </w:r>
             <w:r>
@@ -2436,33 +2230,6 @@
           </w:p>
         </w:tc>
       </w:tr>
-    </w:tbl>
-    <w:p>
-      <w:pPr>
-        <w:outlineLvl w:val="0"/>
-        <w:rPr>
-          <w:rFonts w:ascii="Arial" w:hAnsi="Arial" w:cs="Arial"/>
-          <w:bCs/>
-          <w:sz w:val="11"/>
-          <w:szCs w:val="11"/>
-          <w:u w:val="single"/>
-        </w:rPr>
-      </w:pPr>
-    </w:p>
-    <w:tbl>
-      <w:tblPr>
-        <w:tblW w:w="9923" w:type="dxa"/>
-        <w:tblInd w:w="-147" w:type="dxa"/>
-        <w:tblLayout w:type="fixed"/>
-        <w:tblCellMar>
-          <w:left w:w="0" w:type="dxa"/>
-          <w:right w:w="0" w:type="dxa"/>
-        </w:tblCellMar>
-        <w:tblLook w:val="0000" w:firstRow="0" w:lastRow="0" w:firstColumn="0" w:lastColumn="0" w:noHBand="0" w:noVBand="0"/>
-      </w:tblPr>
-      <w:tblGrid>
-        <w:gridCol w:w="9923"/>
-      </w:tblGrid>
       <w:tr>
         <w:trPr>
           <w:cantSplit/>
@@ -2471,6 +2238,7 @@
         <w:tc>
           <w:tcPr>
             <w:tcW w:w="9923" w:type="dxa"/>
+            <w:gridSpan w:val="4"/>
             <w:tcBorders>
               <w:top w:val="single" w:sz="4" w:space="0" w:color="000000"/>
               <w:left w:val="single" w:sz="4" w:space="0" w:color="000000"/>
@@ -2498,114 +2266,189 @@
                 <w:szCs w:val="20"/>
               </w:rPr>
               <w:t>Descriptif de la réalisation professionnelle, y compris les productions réalisées et schémas explicatifs</w:t>
+            </w:r>
+            <w:r>
+              <w:rPr>
+                <w:rFonts w:ascii="Arial" w:hAnsi="Arial" w:cs="Arial"/>
+                <w:b/>
+                <w:sz w:val="20"/>
+                <w:szCs w:val="20"/>
+              </w:rPr>
               <w:br/>
+            </w:r>
+            <w:r>
+              <w:rPr>
+                <w:rFonts w:ascii="Arial" w:hAnsi="Arial" w:cs="Arial"/>
+                <w:b/>
+                <w:sz w:val="20"/>
+                <w:szCs w:val="20"/>
+              </w:rPr>
               <w:br/>
               <w:t>Contexte : L'infrastructure IRIS Nice, déployée progressivement de 2025 à 2026 (RP-01 à RP-04), comprend un réseau Cisco multi-VLANs, un Active Directory, un hyperviseur KVM et une supervision Grafana. En 1 an, aucun audit de sécurité n'a jamais été réalisé. Les risques sont inconnus : pas de pare-feu dédié, pas de DMZ, SMBv1 et Telnet actifs, OS non durcis (CIS-CAT Windows 41.7%, Lynis Linux 58/100).</w:t>
+            </w:r>
+            <w:r>
+              <w:rPr>
+                <w:rFonts w:ascii="Arial" w:hAnsi="Arial" w:cs="Arial"/>
+                <w:b/>
+                <w:sz w:val="20"/>
+                <w:szCs w:val="20"/>
+              </w:rPr>
               <w:br/>
+            </w:r>
+            <w:r>
+              <w:rPr>
+                <w:rFonts w:ascii="Arial" w:hAnsi="Arial" w:cs="Arial"/>
+                <w:b/>
+                <w:sz w:val="20"/>
+                <w:szCs w:val="20"/>
+              </w:rPr>
               <w:br/>
               <w:t>Missions :</w:t>
+            </w:r>
+            <w:r>
+              <w:rPr>
+                <w:rFonts w:ascii="Arial" w:hAnsi="Arial" w:cs="Arial"/>
+                <w:b/>
+                <w:sz w:val="20"/>
+                <w:szCs w:val="20"/>
+              </w:rPr>
               <w:br/>
+            </w:r>
+            <w:r>
+              <w:rPr>
+                <w:rFonts w:ascii="Arial" w:hAnsi="Arial" w:cs="Arial"/>
+                <w:b/>
+                <w:sz w:val="20"/>
+                <w:szCs w:val="20"/>
+              </w:rPr>
               <w:br/>
               <w:t>- Phase 1 : Audit complet avec 5 outils open source (Nmap, OpenVAS, Lynis, CIS-CAT, Wapiti). Identification de 38 CVE dont 8 critiques (EternalBlue CVSS 9.8, Log4Shell CVSS 10.0). Création d'une matrice des risques (Probabilité x Impact x Délai).</w:t>
+            </w:r>
+            <w:r>
+              <w:rPr>
+                <w:rFonts w:ascii="Arial" w:hAnsi="Arial" w:cs="Arial"/>
+                <w:b/>
+                <w:sz w:val="20"/>
+                <w:szCs w:val="20"/>
+              </w:rPr>
               <w:br/>
+            </w:r>
+            <w:r>
+              <w:rPr>
+                <w:rFonts w:ascii="Arial" w:hAnsi="Arial" w:cs="Arial"/>
+                <w:b/>
+                <w:sz w:val="20"/>
+                <w:szCs w:val="20"/>
+              </w:rPr>
               <w:br/>
-              <w:t>- Phase 2 : Déploiement de pfSense 2.7 avec architecture deny-all par défaut. Création d'une DMZ (172.16.0.0/24) isolée totalement du LAN. Activation de l'IDS/IPS Suricata sur interface WAN (remplace Snort — multi-thread, détection avancée). Règles de filtrage explicites et documentées.</w:t>
+              <w:t>- Phase 2 : Déploiement de Debian 12 (nftables) avec architecture deny-all par défaut. Création d'une DMZ (172.16.0.0/24) isolée totalement du LAN. Activation de l'IDS/IPS Suricata sur interface WAN (remplace Suricata — multi-thread, détection avancée). Règles de filtrage explicites et documentées.</w:t>
+            </w:r>
+            <w:r>
+              <w:rPr>
+                <w:rFonts w:ascii="Arial" w:hAnsi="Arial" w:cs="Arial"/>
+                <w:b/>
+                <w:sz w:val="20"/>
+                <w:szCs w:val="20"/>
+              </w:rPr>
               <w:br/>
+            </w:r>
+            <w:r>
+              <w:rPr>
+                <w:rFonts w:ascii="Arial" w:hAnsi="Arial" w:cs="Arial"/>
+                <w:b/>
+                <w:sz w:val="20"/>
+                <w:szCs w:val="20"/>
+              </w:rPr>
               <w:br/>
-              <w:t>- Phase 3 : Durcissement Linux — remplacement d'UFW par nftables (firewall natif kernel, plus performant) et de Fail2ban par CrowdSec (IPS collaboratif avec threat intelligence communautaire, collections : crowdsecurity/linux, crowdsecurity/sshd). Résultat Lynis : 58 -&gt; 79/100 (+21 pts). Durcissement Windows (SMBv1 off, Credential Guard, LAPS, LLMNR off, 12 GPOs ANSSI) : CIS-CAT 41.7% -&gt; 82% (+40 pts).</w:t>
+              <w:t>- Phase 3 : Durcissement Linux — remplacement d'UFW par nftables (firewall natif kernel, plus performant) et de CrowdSec par CrowdSec (IPS collaboratif avec threat intelligence communautaire, collections : crowdsecurity/linux, crowdsecurity/sshd). Résultat Lynis : 58 -&gt; 79/100 (+21 pts). Durcissement Windows (SMBv1 off, Credential Guard, LAPS, LLMNR off, 12 GPOs ANSSI) : CIS-CAT 41.7% -&gt; 82% (+40 pts).</w:t>
+            </w:r>
+            <w:r>
+              <w:rPr>
+                <w:rFonts w:ascii="Arial" w:hAnsi="Arial" w:cs="Arial"/>
+                <w:b/>
+                <w:sz w:val="20"/>
+                <w:szCs w:val="20"/>
+              </w:rPr>
               <w:br/>
+            </w:r>
+            <w:r>
+              <w:rPr>
+                <w:rFonts w:ascii="Arial" w:hAnsi="Arial" w:cs="Arial"/>
+                <w:b/>
+                <w:sz w:val="20"/>
+                <w:szCs w:val="20"/>
+              </w:rPr>
               <w:br/>
               <w:t>- Phase 4 : 12 tests de pénétration (autorisation signée AUTH-RP05-2026-001) : EternalBlue, brute force SSH, Pass-the-Hash, Telnet Cisco, scan DMZ-&gt;LAN, VLAN Hopping, injection SQL, XSS, Log4Shell, OpenSSL, BloodHound AD, pentest WiFi. Résultat : 12/12 PASS.</w:t>
+            </w:r>
+            <w:r>
+              <w:rPr>
+                <w:rFonts w:ascii="Arial" w:hAnsi="Arial" w:cs="Arial"/>
+                <w:b/>
+                <w:sz w:val="20"/>
+                <w:szCs w:val="20"/>
+              </w:rPr>
               <w:br/>
+            </w:r>
+            <w:r>
+              <w:rPr>
+                <w:rFonts w:ascii="Arial" w:hAnsi="Arial" w:cs="Arial"/>
+                <w:b/>
+                <w:sz w:val="20"/>
+                <w:szCs w:val="20"/>
+              </w:rPr>
               <w:br/>
               <w:t>Contraintes :</w:t>
+            </w:r>
+            <w:r>
+              <w:rPr>
+                <w:rFonts w:ascii="Arial" w:hAnsi="Arial" w:cs="Arial"/>
+                <w:b/>
+                <w:sz w:val="20"/>
+                <w:szCs w:val="20"/>
+              </w:rPr>
               <w:br/>
+            </w:r>
+            <w:r>
+              <w:rPr>
+                <w:rFonts w:ascii="Arial" w:hAnsi="Arial" w:cs="Arial"/>
+                <w:b/>
+                <w:sz w:val="20"/>
+                <w:szCs w:val="20"/>
+              </w:rPr>
               <w:br/>
               <w:t>Environnement de production actif : aucune coupure de service autorisée.</w:t>
+            </w:r>
+            <w:r>
+              <w:rPr>
+                <w:rFonts w:ascii="Arial" w:hAnsi="Arial" w:cs="Arial"/>
+                <w:b/>
+                <w:sz w:val="20"/>
+                <w:szCs w:val="20"/>
+              </w:rPr>
               <w:br/>
               <w:t>Autorisation de pentest obligatoire (cadre légal).</w:t>
+            </w:r>
+            <w:r>
+              <w:rPr>
+                <w:rFonts w:ascii="Arial" w:hAnsi="Arial" w:cs="Arial"/>
+                <w:b/>
+                <w:sz w:val="20"/>
+                <w:szCs w:val="20"/>
+              </w:rPr>
               <w:br/>
               <w:t>Référentiels ANSSI, CIS v8 et NIST CSF à respecter.</w:t>
+            </w:r>
+            <w:r>
+              <w:rPr>
+                <w:rFonts w:ascii="Arial" w:hAnsi="Arial" w:cs="Arial"/>
+                <w:b/>
+                <w:sz w:val="20"/>
+                <w:szCs w:val="20"/>
+              </w:rPr>
               <w:br/>
               <w:t>Deadline fixe : 28/03/2026 (6 semaines).</w:t>
-              <w:br/>
-            </w:r>
-            <w:r>
-              <w:rPr>
-                <w:rFonts w:ascii="Arial" w:hAnsi="Arial" w:cs="Arial"/>
-                <w:b/>
-                <w:sz w:val="20"/>
-                <w:szCs w:val="20"/>
-              </w:rPr>
-            </w:r>
-            <w:r>
-              <w:rPr>
-                <w:rFonts w:ascii="Arial" w:hAnsi="Arial" w:cs="Arial"/>
-                <w:b/>
-                <w:sz w:val="20"/>
-                <w:szCs w:val="20"/>
-              </w:rPr>
-            </w:r>
-            <w:r>
-              <w:rPr>
-                <w:rFonts w:ascii="Arial" w:hAnsi="Arial" w:cs="Arial"/>
-                <w:b/>
-                <w:sz w:val="20"/>
-                <w:szCs w:val="20"/>
-              </w:rPr>
-            </w:r>
-            <w:r>
-              <w:rPr>
-                <w:rFonts w:ascii="Arial" w:hAnsi="Arial" w:cs="Arial"/>
-                <w:b/>
-                <w:sz w:val="20"/>
-                <w:szCs w:val="20"/>
-              </w:rPr>
-            </w:r>
-            <w:r>
-              <w:rPr>
-                <w:rFonts w:ascii="Arial" w:hAnsi="Arial" w:cs="Arial"/>
-                <w:b/>
-                <w:sz w:val="20"/>
-                <w:szCs w:val="20"/>
-              </w:rPr>
-            </w:r>
-            <w:r>
-              <w:rPr>
-                <w:rFonts w:ascii="Arial" w:hAnsi="Arial" w:cs="Arial"/>
-                <w:b/>
-                <w:sz w:val="20"/>
-                <w:szCs w:val="20"/>
-              </w:rPr>
-            </w:r>
-            <w:r>
-              <w:rPr>
-                <w:rFonts w:ascii="Arial" w:hAnsi="Arial" w:cs="Arial"/>
-                <w:b/>
-                <w:sz w:val="20"/>
-                <w:szCs w:val="20"/>
-              </w:rPr>
-            </w:r>
-            <w:r>
-              <w:rPr>
-                <w:rFonts w:ascii="Arial" w:hAnsi="Arial" w:cs="Arial"/>
-                <w:b/>
-                <w:sz w:val="20"/>
-                <w:szCs w:val="20"/>
-              </w:rPr>
-            </w:r>
-          </w:p>
-          <w:p>
-            <w:pPr>
-              <w:snapToGrid w:val="0"/>
-              <w:spacing w:line="276" w:lineRule="auto"/>
-              <w:rPr>
-                <w:rFonts w:ascii="Arial" w:hAnsi="Arial"/>
-                <w:bCs/>
-                <w:sz w:val="20"/>
-                <w:szCs w:val="20"/>
-              </w:rPr>
-            </w:pPr>
+            </w:r>
           </w:p>
           <w:p>
             <w:pPr>
@@ -2621,557 +2464,6 @@
                 <w:szCs w:val="20"/>
               </w:rPr>
             </w:pPr>
-            <w:r>
-              <w:rPr>
-                <w:rFonts w:ascii="Arial" w:hAnsi="Arial"/>
-                <w:b/>
-                <w:sz w:val="20"/>
-                <w:szCs w:val="20"/>
-              </w:rPr>
-            </w:r>
-            <w:r>
-              <w:rPr>
-                <w:rFonts w:ascii="Arial" w:hAnsi="Arial"/>
-                <w:bCs/>
-                <w:sz w:val="20"/>
-                <w:szCs w:val="20"/>
-              </w:rPr>
-            </w:r>
-            <w:r>
-              <w:rPr>
-                <w:rFonts w:ascii="Arial" w:hAnsi="Arial"/>
-                <w:bCs/>
-                <w:sz w:val="20"/>
-                <w:szCs w:val="20"/>
-              </w:rPr>
-            </w:r>
-            <w:r>
-              <w:rPr>
-                <w:rFonts w:ascii="Arial" w:hAnsi="Arial"/>
-                <w:bCs/>
-                <w:sz w:val="20"/>
-                <w:szCs w:val="20"/>
-              </w:rPr>
-            </w:r>
-            <w:r>
-              <w:rPr>
-                <w:rFonts w:ascii="Arial" w:hAnsi="Arial"/>
-                <w:bCs/>
-                <w:sz w:val="20"/>
-                <w:szCs w:val="20"/>
-              </w:rPr>
-            </w:r>
-            <w:r>
-              <w:rPr>
-                <w:rFonts w:ascii="Arial" w:hAnsi="Arial"/>
-                <w:bCs/>
-                <w:sz w:val="20"/>
-                <w:szCs w:val="20"/>
-              </w:rPr>
-            </w:r>
-            <w:r>
-              <w:rPr>
-                <w:rFonts w:ascii="Arial" w:hAnsi="Arial"/>
-                <w:bCs/>
-                <w:sz w:val="20"/>
-                <w:szCs w:val="20"/>
-              </w:rPr>
-            </w:r>
-            <w:r>
-              <w:rPr>
-                <w:rFonts w:ascii="Arial" w:hAnsi="Arial"/>
-                <w:bCs/>
-                <w:sz w:val="20"/>
-                <w:szCs w:val="20"/>
-              </w:rPr>
-            </w:r>
-          </w:p>
-          <w:p>
-            <w:pPr>
-              <w:pBdr>
-                <w:bottom w:val="single" w:sz="12" w:space="1" w:color="auto"/>
-              </w:pBdr>
-              <w:snapToGrid w:val="0"/>
-              <w:spacing w:line="276" w:lineRule="auto"/>
-              <w:rPr>
-                <w:rFonts w:ascii="Arial" w:hAnsi="Arial"/>
-                <w:bCs/>
-                <w:sz w:val="20"/>
-                <w:szCs w:val="20"/>
-              </w:rPr>
-            </w:pPr>
-          </w:p>
-          <w:p>
-            <w:pPr>
-              <w:pBdr>
-                <w:bottom w:val="single" w:sz="12" w:space="1" w:color="auto"/>
-              </w:pBdr>
-              <w:snapToGrid w:val="0"/>
-              <w:spacing w:line="276" w:lineRule="auto"/>
-              <w:rPr>
-                <w:rFonts w:ascii="Arial" w:hAnsi="Arial"/>
-                <w:bCs/>
-                <w:sz w:val="20"/>
-                <w:szCs w:val="20"/>
-              </w:rPr>
-            </w:pPr>
-            <w:r>
-              <w:rPr>
-                <w:rFonts w:ascii="Arial" w:hAnsi="Arial"/>
-                <w:b/>
-                <w:sz w:val="20"/>
-                <w:szCs w:val="20"/>
-              </w:rPr>
-            </w:r>
-            <w:r>
-              <w:rPr>
-                <w:rFonts w:ascii="Arial" w:hAnsi="Arial"/>
-                <w:bCs/>
-                <w:sz w:val="20"/>
-                <w:szCs w:val="20"/>
-              </w:rPr>
-            </w:r>
-          </w:p>
-          <w:p>
-            <w:pPr>
-              <w:pBdr>
-                <w:bottom w:val="single" w:sz="12" w:space="1" w:color="auto"/>
-              </w:pBdr>
-              <w:snapToGrid w:val="0"/>
-              <w:spacing w:line="276" w:lineRule="auto"/>
-              <w:rPr>
-                <w:rFonts w:ascii="Arial" w:hAnsi="Arial"/>
-                <w:bCs/>
-                <w:sz w:val="20"/>
-                <w:szCs w:val="20"/>
-              </w:rPr>
-            </w:pPr>
-          </w:p>
-          <w:p>
-            <w:pPr>
-              <w:pBdr>
-                <w:bottom w:val="single" w:sz="12" w:space="1" w:color="auto"/>
-              </w:pBdr>
-              <w:snapToGrid w:val="0"/>
-              <w:spacing w:line="276" w:lineRule="auto"/>
-              <w:rPr>
-                <w:rFonts w:ascii="Arial" w:hAnsi="Arial"/>
-                <w:bCs/>
-                <w:sz w:val="20"/>
-                <w:szCs w:val="20"/>
-              </w:rPr>
-            </w:pPr>
-            <w:r>
-              <w:rPr>
-                <w:rFonts w:ascii="Arial" w:hAnsi="Arial"/>
-                <w:bCs/>
-                <w:sz w:val="20"/>
-                <w:szCs w:val="20"/>
-              </w:rPr>
-            </w:r>
-            <w:r>
-              <w:rPr>
-                <w:rFonts w:ascii="Arial" w:hAnsi="Arial"/>
-                <w:bCs/>
-                <w:sz w:val="20"/>
-                <w:szCs w:val="20"/>
-              </w:rPr>
-            </w:r>
-            <w:r>
-              <w:rPr>
-                <w:rFonts w:ascii="Arial" w:hAnsi="Arial"/>
-                <w:bCs/>
-                <w:sz w:val="20"/>
-                <w:szCs w:val="20"/>
-              </w:rPr>
-            </w:r>
-            <w:r>
-              <w:rPr>
-                <w:rFonts w:ascii="Arial" w:hAnsi="Arial"/>
-                <w:bCs/>
-                <w:sz w:val="20"/>
-                <w:szCs w:val="20"/>
-              </w:rPr>
-            </w:r>
-            <w:r>
-              <w:rPr>
-                <w:rFonts w:ascii="Arial" w:hAnsi="Arial"/>
-                <w:bCs/>
-                <w:sz w:val="20"/>
-                <w:szCs w:val="20"/>
-              </w:rPr>
-            </w:r>
-          </w:p>
-          <w:p>
-            <w:pPr>
-              <w:pBdr>
-                <w:bottom w:val="single" w:sz="12" w:space="1" w:color="auto"/>
-              </w:pBdr>
-              <w:snapToGrid w:val="0"/>
-              <w:spacing w:line="276" w:lineRule="auto"/>
-              <w:rPr>
-                <w:rFonts w:ascii="Arial" w:hAnsi="Arial"/>
-                <w:bCs/>
-                <w:sz w:val="20"/>
-                <w:szCs w:val="20"/>
-              </w:rPr>
-            </w:pPr>
-          </w:p>
-          <w:p>
-            <w:pPr>
-              <w:pBdr>
-                <w:bottom w:val="single" w:sz="12" w:space="1" w:color="auto"/>
-              </w:pBdr>
-              <w:snapToGrid w:val="0"/>
-              <w:spacing w:line="276" w:lineRule="auto"/>
-              <w:rPr>
-                <w:rFonts w:ascii="Arial" w:hAnsi="Arial"/>
-                <w:bCs/>
-                <w:sz w:val="20"/>
-                <w:szCs w:val="20"/>
-              </w:rPr>
-            </w:pPr>
-            <w:r>
-              <w:rPr>
-                <w:rFonts w:ascii="Arial" w:hAnsi="Arial"/>
-                <w:bCs/>
-                <w:sz w:val="20"/>
-                <w:szCs w:val="20"/>
-              </w:rPr>
-            </w:r>
-          </w:p>
-          <w:p>
-            <w:pPr>
-              <w:pBdr>
-                <w:bottom w:val="single" w:sz="12" w:space="1" w:color="auto"/>
-              </w:pBdr>
-              <w:snapToGrid w:val="0"/>
-              <w:spacing w:line="276" w:lineRule="auto"/>
-              <w:rPr>
-                <w:rFonts w:ascii="Arial" w:hAnsi="Arial"/>
-                <w:bCs/>
-                <w:sz w:val="20"/>
-                <w:szCs w:val="20"/>
-              </w:rPr>
-            </w:pPr>
-          </w:p>
-          <w:p>
-            <w:pPr>
-              <w:pBdr>
-                <w:bottom w:val="single" w:sz="12" w:space="1" w:color="auto"/>
-              </w:pBdr>
-              <w:snapToGrid w:val="0"/>
-              <w:spacing w:line="276" w:lineRule="auto"/>
-              <w:rPr>
-                <w:rFonts w:ascii="Arial" w:hAnsi="Arial"/>
-                <w:bCs/>
-                <w:sz w:val="20"/>
-                <w:szCs w:val="20"/>
-              </w:rPr>
-            </w:pPr>
-            <w:r>
-              <w:rPr>
-                <w:rFonts w:ascii="Arial" w:hAnsi="Arial"/>
-                <w:bCs/>
-                <w:sz w:val="20"/>
-                <w:szCs w:val="20"/>
-              </w:rPr>
-            </w:r>
-            <w:r>
-              <w:rPr>
-                <w:rFonts w:ascii="Arial" w:hAnsi="Arial"/>
-                <w:bCs/>
-                <w:sz w:val="20"/>
-                <w:szCs w:val="20"/>
-              </w:rPr>
-            </w:r>
-            <w:r>
-              <w:rPr>
-                <w:rFonts w:ascii="Arial" w:hAnsi="Arial"/>
-                <w:bCs/>
-                <w:sz w:val="20"/>
-                <w:szCs w:val="20"/>
-              </w:rPr>
-            </w:r>
-            <w:r>
-              <w:rPr>
-                <w:rFonts w:ascii="Arial" w:hAnsi="Arial"/>
-                <w:bCs/>
-                <w:sz w:val="20"/>
-                <w:szCs w:val="20"/>
-              </w:rPr>
-            </w:r>
-            <w:r>
-              <w:rPr>
-                <w:rFonts w:ascii="Arial" w:hAnsi="Arial"/>
-                <w:bCs/>
-                <w:sz w:val="20"/>
-                <w:szCs w:val="20"/>
-              </w:rPr>
-            </w:r>
-            <w:r>
-              <w:rPr>
-                <w:rFonts w:ascii="Arial" w:hAnsi="Arial"/>
-                <w:bCs/>
-                <w:sz w:val="20"/>
-                <w:szCs w:val="20"/>
-              </w:rPr>
-            </w:r>
-          </w:p>
-          <w:p>
-            <w:pPr>
-              <w:pBdr>
-                <w:bottom w:val="single" w:sz="12" w:space="1" w:color="auto"/>
-              </w:pBdr>
-              <w:snapToGrid w:val="0"/>
-              <w:spacing w:line="276" w:lineRule="auto"/>
-              <w:rPr>
-                <w:rFonts w:ascii="Arial" w:hAnsi="Arial"/>
-                <w:bCs/>
-                <w:sz w:val="20"/>
-                <w:szCs w:val="20"/>
-              </w:rPr>
-            </w:pPr>
-          </w:p>
-          <w:p>
-            <w:pPr>
-              <w:pBdr>
-                <w:bottom w:val="single" w:sz="12" w:space="1" w:color="auto"/>
-              </w:pBdr>
-              <w:snapToGrid w:val="0"/>
-              <w:spacing w:line="276" w:lineRule="auto"/>
-              <w:rPr>
-                <w:rFonts w:ascii="Arial" w:hAnsi="Arial"/>
-                <w:bCs/>
-                <w:sz w:val="20"/>
-                <w:szCs w:val="20"/>
-              </w:rPr>
-            </w:pPr>
-            <w:r>
-              <w:rPr>
-                <w:rFonts w:ascii="Arial" w:hAnsi="Arial"/>
-                <w:bCs/>
-                <w:sz w:val="20"/>
-                <w:szCs w:val="20"/>
-              </w:rPr>
-            </w:r>
-            <w:r>
-              <w:rPr>
-                <w:rFonts w:ascii="Arial" w:hAnsi="Arial"/>
-                <w:bCs/>
-                <w:sz w:val="20"/>
-                <w:szCs w:val="20"/>
-              </w:rPr>
-            </w:r>
-            <w:r>
-              <w:rPr>
-                <w:rFonts w:ascii="Arial" w:hAnsi="Arial"/>
-                <w:bCs/>
-                <w:sz w:val="20"/>
-                <w:szCs w:val="20"/>
-              </w:rPr>
-            </w:r>
-            <w:r>
-              <w:rPr>
-                <w:rFonts w:ascii="Arial" w:hAnsi="Arial"/>
-                <w:bCs/>
-                <w:sz w:val="20"/>
-                <w:szCs w:val="20"/>
-              </w:rPr>
-            </w:r>
-            <w:r>
-              <w:rPr>
-                <w:rFonts w:ascii="Arial" w:hAnsi="Arial"/>
-                <w:bCs/>
-                <w:sz w:val="20"/>
-                <w:szCs w:val="20"/>
-              </w:rPr>
-            </w:r>
-            <w:r>
-              <w:rPr>
-                <w:rFonts w:ascii="Arial" w:hAnsi="Arial"/>
-                <w:bCs/>
-                <w:sz w:val="20"/>
-                <w:szCs w:val="20"/>
-              </w:rPr>
-            </w:r>
-            <w:r>
-              <w:rPr>
-                <w:rFonts w:ascii="Arial" w:hAnsi="Arial"/>
-                <w:bCs/>
-                <w:sz w:val="20"/>
-                <w:szCs w:val="20"/>
-              </w:rPr>
-            </w:r>
-          </w:p>
-          <w:p>
-            <w:pPr>
-              <w:pBdr>
-                <w:bottom w:val="single" w:sz="12" w:space="1" w:color="auto"/>
-              </w:pBdr>
-              <w:snapToGrid w:val="0"/>
-              <w:spacing w:line="276" w:lineRule="auto"/>
-              <w:rPr>
-                <w:rFonts w:ascii="Arial" w:hAnsi="Arial"/>
-                <w:bCs/>
-                <w:sz w:val="20"/>
-                <w:szCs w:val="20"/>
-              </w:rPr>
-            </w:pPr>
-          </w:p>
-          <w:p>
-            <w:pPr>
-              <w:pBdr>
-                <w:bottom w:val="single" w:sz="12" w:space="1" w:color="auto"/>
-              </w:pBdr>
-              <w:snapToGrid w:val="0"/>
-              <w:spacing w:line="276" w:lineRule="auto"/>
-              <w:rPr>
-                <w:rFonts w:ascii="Arial" w:hAnsi="Arial"/>
-                <w:bCs/>
-                <w:sz w:val="20"/>
-                <w:szCs w:val="20"/>
-              </w:rPr>
-            </w:pPr>
-            <w:r>
-              <w:rPr>
-                <w:rFonts w:ascii="Arial" w:hAnsi="Arial"/>
-                <w:b/>
-                <w:sz w:val="20"/>
-                <w:szCs w:val="20"/>
-              </w:rPr>
-            </w:r>
-            <w:r>
-              <w:rPr>
-                <w:rFonts w:ascii="Arial" w:hAnsi="Arial"/>
-                <w:bCs/>
-                <w:sz w:val="20"/>
-                <w:szCs w:val="20"/>
-              </w:rPr>
-            </w:r>
-          </w:p>
-          <w:p>
-            <w:pPr>
-              <w:pBdr>
-                <w:bottom w:val="single" w:sz="12" w:space="1" w:color="auto"/>
-              </w:pBdr>
-              <w:snapToGrid w:val="0"/>
-              <w:spacing w:line="276" w:lineRule="auto"/>
-              <w:rPr>
-                <w:rFonts w:ascii="Arial" w:hAnsi="Arial"/>
-                <w:bCs/>
-                <w:sz w:val="20"/>
-                <w:szCs w:val="20"/>
-              </w:rPr>
-            </w:pPr>
-          </w:p>
-          <w:p>
-            <w:pPr>
-              <w:pBdr>
-                <w:bottom w:val="single" w:sz="12" w:space="1" w:color="auto"/>
-              </w:pBdr>
-              <w:snapToGrid w:val="0"/>
-              <w:spacing w:line="276" w:lineRule="auto"/>
-              <w:rPr>
-                <w:rFonts w:ascii="Arial" w:hAnsi="Arial"/>
-                <w:bCs/>
-                <w:sz w:val="20"/>
-                <w:szCs w:val="20"/>
-              </w:rPr>
-            </w:pPr>
-            <w:r>
-              <w:rPr>
-                <w:rFonts w:ascii="Arial" w:hAnsi="Arial"/>
-                <w:bCs/>
-                <w:sz w:val="20"/>
-                <w:szCs w:val="20"/>
-              </w:rPr>
-            </w:r>
-          </w:p>
-          <w:p>
-            <w:pPr>
-              <w:pBdr>
-                <w:bottom w:val="single" w:sz="12" w:space="1" w:color="auto"/>
-              </w:pBdr>
-              <w:snapToGrid w:val="0"/>
-              <w:spacing w:line="276" w:lineRule="auto"/>
-              <w:rPr>
-                <w:rFonts w:ascii="Arial" w:hAnsi="Arial"/>
-                <w:bCs/>
-                <w:sz w:val="20"/>
-                <w:szCs w:val="20"/>
-              </w:rPr>
-            </w:pPr>
-            <w:r>
-              <w:rPr>
-                <w:rFonts w:ascii="Arial" w:hAnsi="Arial"/>
-                <w:bCs/>
-                <w:sz w:val="20"/>
-                <w:szCs w:val="20"/>
-              </w:rPr>
-            </w:r>
-          </w:p>
-          <w:p>
-            <w:pPr>
-              <w:pBdr>
-                <w:bottom w:val="single" w:sz="12" w:space="1" w:color="auto"/>
-              </w:pBdr>
-              <w:snapToGrid w:val="0"/>
-              <w:spacing w:line="276" w:lineRule="auto"/>
-              <w:rPr>
-                <w:rFonts w:ascii="Arial" w:hAnsi="Arial"/>
-                <w:bCs/>
-                <w:sz w:val="20"/>
-                <w:szCs w:val="20"/>
-              </w:rPr>
-            </w:pPr>
-            <w:r>
-              <w:rPr>
-                <w:rFonts w:ascii="Arial" w:hAnsi="Arial"/>
-                <w:bCs/>
-                <w:sz w:val="20"/>
-                <w:szCs w:val="20"/>
-              </w:rPr>
-            </w:r>
-            <w:r>
-              <w:rPr>
-                <w:rFonts w:ascii="Arial" w:hAnsi="Arial"/>
-                <w:bCs/>
-                <w:sz w:val="20"/>
-                <w:szCs w:val="20"/>
-              </w:rPr>
-            </w:r>
-            <w:r>
-              <w:rPr>
-                <w:rFonts w:ascii="Arial" w:hAnsi="Arial"/>
-                <w:bCs/>
-                <w:sz w:val="20"/>
-                <w:szCs w:val="20"/>
-              </w:rPr>
-            </w:r>
-          </w:p>
-          <w:p>
-            <w:pPr>
-              <w:pBdr>
-                <w:bottom w:val="single" w:sz="12" w:space="1" w:color="auto"/>
-              </w:pBdr>
-              <w:snapToGrid w:val="0"/>
-              <w:spacing w:line="276" w:lineRule="auto"/>
-              <w:rPr>
-                <w:rFonts w:ascii="Arial" w:hAnsi="Arial"/>
-                <w:bCs/>
-                <w:sz w:val="20"/>
-                <w:szCs w:val="20"/>
-              </w:rPr>
-            </w:pPr>
-            <w:r>
-              <w:rPr>
-                <w:rFonts w:ascii="Arial" w:hAnsi="Arial"/>
-                <w:bCs/>
-                <w:sz w:val="20"/>
-                <w:szCs w:val="20"/>
-              </w:rPr>
-            </w:r>
           </w:p>
           <w:p>
             <w:pPr>
@@ -3198,6 +2490,7 @@
         <w:tc>
           <w:tcPr>
             <w:tcW w:w="9923" w:type="dxa"/>
+            <w:gridSpan w:val="4"/>
             <w:tcBorders>
               <w:top w:val="single" w:sz="4" w:space="0" w:color="000000"/>
               <w:left w:val="single" w:sz="4" w:space="0" w:color="000000"/>
@@ -3224,26 +2517,26 @@
                 <w:sz w:val="20"/>
                 <w:szCs w:val="20"/>
               </w:rPr>
-              <w:t>Bilan : 8 vulnérabilités critiques identifiées et corrigées (0 faille critique résiduelle). 12 tests de pénétration valides (12/12 PASS). PV signé le 25/03/2026. Remplacement de Snort par Suricata (IDS/IPS avancé), UFW/Fail2ban par nftables + CrowdSec (IPS collaboratif — threat intelligence communautaire). 9 livrables produits : rapport d'audit, matrice des risques, documentation pfSense, schéma DMZ, rapports durcissement Linux et Windows, PV pentests, plan d'action résiduel, autorisation de pentest. Compétences BTS SIO Bloc 3 validées : B3.1 - B3.2 - B3.3.</w:t>
+              <w:t>Bilan : 8 vulnérabilités critiques identifiées et corrigées (0 faille critique résiduelle). 12 tests de pénétration valides (12/12 PASS). PV signé le 25/03/2026. Remplacement de Suricata par Suricata (IDS/IPS avancé), UFW/CrowdSec par nftables + CrowdSec (IPS collaboratif — threat intelligence communautaire). 9 livrables produits : rapport d'audit, matrice des risques, documentation Debian 12 (nftables), schéma DMZ, rapports durcissement Linux et Windows, PV pentests, plan d'action résiduel, autorisation de pentest. Compétences BTS SIO Bloc 3 validées : B3.1 - B3.2 - B3.3.</w:t>
+            </w:r>
+            <w:r>
+              <w:rPr>
+                <w:rFonts w:ascii="Arial" w:hAnsi="Arial" w:cs="Arial"/>
+                <w:b/>
+                <w:sz w:val="20"/>
+                <w:szCs w:val="20"/>
+              </w:rPr>
               <w:br/>
+            </w:r>
+            <w:r>
+              <w:rPr>
+                <w:rFonts w:ascii="Arial" w:hAnsi="Arial" w:cs="Arial"/>
+                <w:b/>
+                <w:sz w:val="20"/>
+                <w:szCs w:val="20"/>
+              </w:rPr>
               <w:br/>
               <w:t>Les informations détaillées sont dans le compte rendu, accessible en ligne, via le lien GitHub qui présente cette réalisation professionnelle (au recto).</w:t>
-            </w:r>
-            <w:r>
-              <w:rPr>
-                <w:rFonts w:ascii="Arial" w:hAnsi="Arial" w:cs="Arial"/>
-                <w:bCs/>
-                <w:sz w:val="20"/>
-                <w:szCs w:val="20"/>
-              </w:rPr>
-            </w:r>
-            <w:r>
-              <w:rPr>
-                <w:rFonts w:ascii="Arial" w:hAnsi="Arial" w:cs="Arial"/>
-                <w:bCs/>
-                <w:sz w:val="20"/>
-                <w:szCs w:val="20"/>
-              </w:rPr>
             </w:r>
           </w:p>
           <w:p>
@@ -3269,14 +2562,6 @@
                 <w:szCs w:val="20"/>
               </w:rPr>
             </w:pPr>
-            <w:r>
-              <w:rPr>
-                <w:rFonts w:ascii="Arial" w:hAnsi="Arial" w:cs="Arial"/>
-                <w:bCs/>
-                <w:sz w:val="20"/>
-                <w:szCs w:val="20"/>
-              </w:rPr>
-            </w:r>
           </w:p>
         </w:tc>
       </w:tr>
@@ -3569,123 +2854,6 @@
   <w:footnote w:id="1">
     <w:p>
       <w:pPr>
-        <w:pStyle w:val="Notedebasdepage"/>
-        <w:jc w:val="both"/>
-        <w:rPr>
-          <w:rFonts w:ascii="Arial" w:hAnsi="Arial"/>
-          <w:sz w:val="16"/>
-          <w:szCs w:val="18"/>
-        </w:rPr>
-      </w:pPr>
-      <w:r>
-        <w:rPr>
-          <w:rStyle w:val="Appelnotedebasdep"/>
-        </w:rPr>
-        <w:footnoteRef/>
-      </w:r>
-      <w:r>
-        <w:rPr>
-          <w:rStyle w:val="Appelnotedebasdep"/>
-        </w:rPr>
-        <w:t xml:space="preserve"> </w:t>
-      </w:r>
-      <w:r>
-        <w:rPr>
-          <w:rFonts w:ascii="Arial" w:hAnsi="Arial"/>
-          <w:sz w:val="16"/>
-          <w:szCs w:val="18"/>
-        </w:rPr>
-        <w:t xml:space="preserve">En référence aux </w:t>
-      </w:r>
-      <w:r>
-        <w:rPr>
-          <w:rFonts w:ascii="Arial" w:hAnsi="Arial"/>
-          <w:i/>
-          <w:iCs/>
-          <w:sz w:val="16"/>
-          <w:szCs w:val="18"/>
-        </w:rPr>
-        <w:t>conditions de réalisation et ressources nécessaires</w:t>
-      </w:r>
-      <w:r>
-        <w:rPr>
-          <w:rFonts w:ascii="Arial" w:hAnsi="Arial"/>
-          <w:sz w:val="16"/>
-          <w:szCs w:val="18"/>
-        </w:rPr>
-        <w:t xml:space="preserve"> du bloc « Administration des systèmes et des réseaux » prévues dans le référentiel de certification du BTS SIO.</w:t>
-      </w:r>
-    </w:p>
-  </w:footnote>
-  <w:footnote w:id="2">
-    <w:p>
-      <w:pPr>
-        <w:pStyle w:val="Notedebasdepage"/>
-        <w:rPr>
-          <w:rFonts w:ascii="Arial" w:hAnsi="Arial" w:cs="Arial"/>
-          <w:sz w:val="16"/>
-          <w:szCs w:val="16"/>
-        </w:rPr>
-      </w:pPr>
-      <w:r>
-        <w:rPr>
-          <w:rStyle w:val="Appelnotedebasdep"/>
-        </w:rPr>
-        <w:footnoteRef/>
-      </w:r>
-      <w:r>
-        <w:rPr>
-          <w:rFonts w:ascii="Arial" w:hAnsi="Arial" w:cs="Arial"/>
-          <w:sz w:val="16"/>
-          <w:szCs w:val="16"/>
-        </w:rPr>
-        <w:t xml:space="preserve"> </w:t>
-      </w:r>
-      <w:r>
-        <w:rPr>
-          <w:rFonts w:ascii="Arial" w:hAnsi="Arial" w:cs="Arial"/>
-          <w:sz w:val="16"/>
-          <w:szCs w:val="16"/>
-        </w:rPr>
-        <w:t>Les réalisations professionnelles sont</w:t>
-      </w:r>
-      <w:r>
-        <w:rPr>
-          <w:rFonts w:ascii="Arial" w:hAnsi="Arial" w:cs="Arial"/>
-          <w:sz w:val="16"/>
-          <w:szCs w:val="16"/>
-        </w:rPr>
-        <w:t xml:space="preserve"> élaborées dans un environnement technologique conforme à l’annexe II.E</w:t>
-      </w:r>
-      <w:r>
-        <w:rPr>
-          <w:rFonts w:ascii="Arial" w:hAnsi="Arial" w:cs="Arial"/>
-          <w:sz w:val="16"/>
-          <w:szCs w:val="16"/>
-        </w:rPr>
-        <w:t xml:space="preserve"> du </w:t>
-      </w:r>
-      <w:r>
-        <w:rPr>
-          <w:rFonts w:ascii="Arial" w:hAnsi="Arial"/>
-          <w:sz w:val="16"/>
-          <w:szCs w:val="22"/>
-        </w:rPr>
-        <w:t>référentiel du BTS SIO</w:t>
-      </w:r>
-      <w:r>
-        <w:rPr>
-          <w:rFonts w:ascii="Arial" w:hAnsi="Arial"/>
-          <w:sz w:val="16"/>
-          <w:szCs w:val="22"/>
-        </w:rPr>
-        <w:t>.</w:t>
-      </w:r>
-    </w:p>
-  </w:footnote>
-  <w:footnote w:id="3">
-    <w:p>
-      <w:pPr>
         <w:suppressAutoHyphens w:val="0"/>
         <w:autoSpaceDE w:val="0"/>
         <w:autoSpaceDN w:val="0"/>
@@ -3790,7 +2958,7 @@
       </w:r>
     </w:p>
   </w:footnote>
-  <w:footnote w:id="4">
+  <w:footnote w:id="2">
     <w:p>
       <w:pPr>
         <w:suppressAutoHyphens w:val="0"/>
@@ -6871,26 +6039,10 @@
 </file>
 
 <file path=customXml/item1.xml><?xml version="1.0" encoding="utf-8"?>
-<?mso-contentType ?>
-<FormTemplates xmlns="http://schemas.microsoft.com/sharepoint/v3/contenttype/forms">
-  <Display>DocumentLibraryForm</Display>
-  <Edit>DocumentLibraryForm</Edit>
-  <New>DocumentLibraryForm</New>
-</FormTemplates>
+<b:Sources xmlns:b="http://schemas.openxmlformats.org/officeDocument/2006/bibliography" xmlns="http://schemas.openxmlformats.org/officeDocument/2006/bibliography" SelectedStyle="/APASixthEditionOfficeOnline.xsl" StyleName="APA" Version="6"/>
 </file>
 
 <file path=customXml/item2.xml><?xml version="1.0" encoding="utf-8"?>
-<p:properties xmlns:p="http://schemas.microsoft.com/office/2006/metadata/properties" xmlns:xsi="http://www.w3.org/2001/XMLSchema-instance" xmlns:pc="http://schemas.microsoft.com/office/infopath/2007/PartnerControls">
-  <documentManagement>
-    <lcf76f155ced4ddcb4097134ff3c332f xmlns="665588ff-5dd3-431a-aaf4-bd4a76d54561">
-      <Terms xmlns="http://schemas.microsoft.com/office/infopath/2007/PartnerControls"/>
-    </lcf76f155ced4ddcb4097134ff3c332f>
-    <TaxCatchAll xmlns="8dfcfa40-b15b-4f0f-a13d-24527312d446" xsi:nil="true"/>
-  </documentManagement>
-</p:properties>
-</file>
-
-<file path=customXml/item3.xml><?xml version="1.0" encoding="utf-8"?>
 <ct:contentTypeSchema xmlns:ct="http://schemas.microsoft.com/office/2006/metadata/contentType" xmlns:ma="http://schemas.microsoft.com/office/2006/metadata/properties/metaAttributes" ct:_="" ma:_="" ma:contentTypeName="Document" ma:contentTypeID="0x0101008AE0F883AF2FBF40B99517BA0C06EE18" ma:contentTypeVersion="12" ma:contentTypeDescription="Crée un document." ma:contentTypeScope="" ma:versionID="445d13d1896fb7d8a8ec4c2c44985985">
   <xsd:schema xmlns:xsd="http://www.w3.org/2001/XMLSchema" xmlns:xs="http://www.w3.org/2001/XMLSchema" xmlns:p="http://schemas.microsoft.com/office/2006/metadata/properties" xmlns:ns2="665588ff-5dd3-431a-aaf4-bd4a76d54561" xmlns:ns3="8dfcfa40-b15b-4f0f-a13d-24527312d446" targetNamespace="http://schemas.microsoft.com/office/2006/metadata/properties" ma:root="true" ma:fieldsID="dbe3dc835e4d4d8f1ad9eb10187843d0" ns2:_="" ns3:_="">
     <xsd:import namespace="665588ff-5dd3-431a-aaf4-bd4a76d54561"/>
@@ -7091,30 +6243,35 @@
 </ct:contentTypeSchema>
 </file>
 
+<file path=customXml/item3.xml><?xml version="1.0" encoding="utf-8"?>
+<p:properties xmlns:p="http://schemas.microsoft.com/office/2006/metadata/properties" xmlns:xsi="http://www.w3.org/2001/XMLSchema-instance" xmlns:pc="http://schemas.microsoft.com/office/infopath/2007/PartnerControls">
+  <documentManagement>
+    <lcf76f155ced4ddcb4097134ff3c332f xmlns="665588ff-5dd3-431a-aaf4-bd4a76d54561">
+      <Terms xmlns="http://schemas.microsoft.com/office/infopath/2007/PartnerControls"/>
+    </lcf76f155ced4ddcb4097134ff3c332f>
+    <TaxCatchAll xmlns="8dfcfa40-b15b-4f0f-a13d-24527312d446" xsi:nil="true"/>
+  </documentManagement>
+</p:properties>
+</file>
+
 <file path=customXml/item4.xml><?xml version="1.0" encoding="utf-8"?>
-<b:Sources xmlns:b="http://schemas.openxmlformats.org/officeDocument/2006/bibliography" xmlns="http://schemas.openxmlformats.org/officeDocument/2006/bibliography" SelectedStyle="/APASixthEditionOfficeOnline.xsl" StyleName="APA" Version="6"/>
+<?mso-contentType ?>
+<FormTemplates xmlns="http://schemas.microsoft.com/sharepoint/v3/contenttype/forms">
+  <Display>DocumentLibraryForm</Display>
+  <Edit>DocumentLibraryForm</Edit>
+  <New>DocumentLibraryForm</New>
+</FormTemplates>
 </file>
 
 <file path=customXml/itemProps1.xml><?xml version="1.0" encoding="utf-8"?>
-<ds:datastoreItem xmlns:ds="http://schemas.openxmlformats.org/officeDocument/2006/customXml" ds:itemID="{421C29E2-8864-4405-82FC-E0AD4EB3622D}">
+<ds:datastoreItem xmlns:ds="http://schemas.openxmlformats.org/officeDocument/2006/customXml" ds:itemID="{5B9A59D0-D70D-4250-BFDA-A75B70B6051A}">
   <ds:schemaRefs>
-    <ds:schemaRef ds:uri="http://schemas.microsoft.com/sharepoint/v3/contenttype/forms"/>
+    <ds:schemaRef ds:uri="http://schemas.openxmlformats.org/officeDocument/2006/bibliography"/>
   </ds:schemaRefs>
 </ds:datastoreItem>
 </file>
 
 <file path=customXml/itemProps2.xml><?xml version="1.0" encoding="utf-8"?>
-<ds:datastoreItem xmlns:ds="http://schemas.openxmlformats.org/officeDocument/2006/customXml" ds:itemID="{CBF00465-66ED-4FF9-B17C-38030A19B8C4}">
-  <ds:schemaRefs>
-    <ds:schemaRef ds:uri="http://schemas.microsoft.com/office/2006/metadata/properties"/>
-    <ds:schemaRef ds:uri="http://schemas.microsoft.com/office/infopath/2007/PartnerControls"/>
-    <ds:schemaRef ds:uri="665588ff-5dd3-431a-aaf4-bd4a76d54561"/>
-    <ds:schemaRef ds:uri="8dfcfa40-b15b-4f0f-a13d-24527312d446"/>
-  </ds:schemaRefs>
-</ds:datastoreItem>
-</file>
-
-<file path=customXml/itemProps3.xml><?xml version="1.0" encoding="utf-8"?>
 <ds:datastoreItem xmlns:ds="http://schemas.openxmlformats.org/officeDocument/2006/customXml" ds:itemID="{185B6DCE-BCCB-4E8A-A829-6A92DB031104}">
   <ds:schemaRefs>
     <ds:schemaRef ds:uri="http://schemas.microsoft.com/office/2006/metadata/contentType"/>
@@ -7133,10 +6290,21 @@
 </ds:datastoreItem>
 </file>
 
+<file path=customXml/itemProps3.xml><?xml version="1.0" encoding="utf-8"?>
+<ds:datastoreItem xmlns:ds="http://schemas.openxmlformats.org/officeDocument/2006/customXml" ds:itemID="{CBF00465-66ED-4FF9-B17C-38030A19B8C4}">
+  <ds:schemaRefs>
+    <ds:schemaRef ds:uri="http://schemas.microsoft.com/office/2006/metadata/properties"/>
+    <ds:schemaRef ds:uri="http://schemas.microsoft.com/office/infopath/2007/PartnerControls"/>
+    <ds:schemaRef ds:uri="665588ff-5dd3-431a-aaf4-bd4a76d54561"/>
+    <ds:schemaRef ds:uri="8dfcfa40-b15b-4f0f-a13d-24527312d446"/>
+  </ds:schemaRefs>
+</ds:datastoreItem>
+</file>
+
 <file path=customXml/itemProps4.xml><?xml version="1.0" encoding="utf-8"?>
-<ds:datastoreItem xmlns:ds="http://schemas.openxmlformats.org/officeDocument/2006/customXml" ds:itemID="{5B9A59D0-D70D-4250-BFDA-A75B70B6051A}">
+<ds:datastoreItem xmlns:ds="http://schemas.openxmlformats.org/officeDocument/2006/customXml" ds:itemID="{421C29E2-8864-4405-82FC-E0AD4EB3622D}">
   <ds:schemaRefs>
-    <ds:schemaRef ds:uri="http://schemas.openxmlformats.org/officeDocument/2006/bibliography"/>
+    <ds:schemaRef ds:uri="http://schemas.microsoft.com/sharepoint/v3/contenttype/forms"/>
   </ds:schemaRefs>
 </ds:datastoreItem>
 </file>
</xml_diff>